<commit_message>
S5: Autorenweg – Markdown mit Vorlagen, Word- und PDF-Import, Verlustmessung
- Kern: author-Modul (Dokumentmodell, Schreiber nach Mindestprofil, Markdown-Leser,
  Word-Leser nach Tabelle 15.2), Vorlagen frei/bericht/brief/angebot und eigene aus Datei,
  manifest.json#subset aus createContainer; Kommandozeile hpro author vorlagen|neu|md|docx|pdf
- Belege: Prüfer 0 Fehler und epubcheck 0/0/0/0 für Markdown-, Word- und PDF-Ergebnisse,
  Verlustmessung je Abschnitt/Tabelle/Bild/Fußnote gegen Grundwahrheit, 29 Grenzfälle,
  Darstellung in Chromium, npm test 584/584
- docs/12-autorenweg.md beantwortet Frage 5 aus docs/10; Änderungsantrag HPC-0011

Co-Authored-By: Claude Opus 5.5 <noreply@anthropic.com>
</commit_message>
<xml_diff>
--- a/docs/belege/S5/eingabe/grenzfall.docx
+++ b/docs/belege/S5/eingabe/grenzfall.docx
@@ -432,8 +432,50 @@
       <w:r>
         <w:drawing>
           <wp:inline xmlns:a="http://schemas.openxmlformats.org/drawingml/2006/main" xmlns:pic="http://schemas.openxmlformats.org/drawingml/2006/picture">
+            <wp:extent cx="3600000" cy="48000"/>
+            <wp:docPr id="3" name="Picture 3">
+              <a:extLst>
+                <a:ext uri="{C183D7F6-B498-43B3-948B-1728B52AA6E4}">
+                  <adec:decorative xmlns:adec="http://schemas.microsoft.com/office/drawing/2017/decorative" val="1"/>
+                </a:ext>
+              </a:extLst>
+            </wp:docPr>
+            <wp:cNvGraphicFramePr>
+              <a:graphicFrameLocks noChangeAspect="1"/>
+            </wp:cNvGraphicFramePr>
+            <a:graphic>
+              <a:graphicData uri="http://schemas.openxmlformats.org/drawingml/2006/picture">
+                <pic:pic>
+                  <pic:nvPicPr>
+                    <pic:cNvPr id="0" name="image.png"/>
+                    <pic:cNvPicPr/>
+                  </pic:nvPicPr>
+                  <pic:blipFill>
+                    <a:blip r:embed="rId15"/>
+                    <a:stretch>
+                      <a:fillRect/>
+                    </a:stretch>
+                  </pic:blipFill>
+                  <pic:spPr>
+                    <a:xfrm>
+                      <a:off x="0" y="0"/>
+                      <a:ext cx="3600000" cy="48000"/>
+                    </a:xfrm>
+                    <a:prstGeom prst="rect"/>
+                  </pic:spPr>
+                </pic:pic>
+              </a:graphicData>
+            </a:graphic>
+          </wp:inline>
+        </w:drawing>
+      </w:r>
+    </w:p>
+    <w:p>
+      <w:r>
+        <w:drawing>
+          <wp:inline xmlns:a="http://schemas.openxmlformats.org/drawingml/2006/main" xmlns:pic="http://schemas.openxmlformats.org/drawingml/2006/picture">
             <wp:extent cx="720000" cy="480000"/>
-            <wp:docPr id="3" name="Picture 3" descr="Kleines Bild im BMP-Format"/>
+            <wp:docPr id="4" name="Picture 4" descr="Kleines Bild im BMP-Format"/>
             <wp:cNvGraphicFramePr>
               <a:graphicFrameLocks noChangeAspect="1"/>
             </wp:cNvGraphicFramePr>
@@ -445,7 +487,7 @@
                     <pic:cNvPicPr/>
                   </pic:nvPicPr>
                   <pic:blipFill>
-                    <a:blip r:embed="rId15"/>
+                    <a:blip r:embed="rId16"/>
                     <a:stretch>
                       <a:fillRect/>
                     </a:stretch>
@@ -701,7 +743,7 @@
 
 <file path=word/comments.xml><?xml version="1.0" encoding="utf-8"?>
 <w:comments xmlns:a="http://schemas.openxmlformats.org/drawingml/2006/main" xmlns:pic="http://schemas.openxmlformats.org/drawingml/2006/picture" xmlns:r="http://schemas.openxmlformats.org/officeDocument/2006/relationships" xmlns:w="http://schemas.openxmlformats.org/wordprocessingml/2006/main" xmlns:wp="http://schemas.openxmlformats.org/drawingml/2006/wordprocessingDrawing" xmlns:mc="http://schemas.openxmlformats.org/markup-compatibility/2006" xmlns:a14="http://schemas.microsoft.com/office/drawing/2010/main" xmlns:w14="http://schemas.microsoft.com/office/word/2010/wordml" xmlns:wpc="http://schemas.microsoft.com/office/word/2010/wordprocessingCanvas">
-  <w:comment w:id="0" w:author="Prüfer" w:initials="PR" w:date="2026-10-13T05:25:45Z">
+  <w:comment w:id="0" w:author="Prüfer" w:initials="PR" w:date="2026-10-13T05:44:43Z">
     <w:p>
       <w:pPr>
         <w:pStyle w:val="CommentText"/>

</xml_diff>